<commit_message>
Analisis de problema SIMCA
al fin termine el primer documento :3
</commit_message>
<xml_diff>
--- a/analisis de problema_github mike - copia.docx
+++ b/analisis de problema_github mike - copia.docx
@@ -67,36 +67,565 @@
       <w:pPr>
         <w:jc w:val="center"/>
         <w:rPr>
-          <w:lang w:val="es-ES"/>
-        </w:rPr>
-      </w:pPr>
-    </w:p>
-    <w:p>
-      <w:pPr>
-        <w:rPr>
-          <w:lang w:val="es-ES"/>
-        </w:rPr>
-      </w:pPr>
-      <w:r>
+          <w:b/>
+          <w:bCs/>
+          <w:sz w:val="36"/>
+          <w:szCs w:val="36"/>
+        </w:rPr>
+      </w:pPr>
+      <w:r>
+        <w:rPr>
+          <w:b/>
+          <w:bCs/>
+          <w:sz w:val="36"/>
+          <w:szCs w:val="36"/>
+        </w:rPr>
+        <w:t>Servicio nacional de aprendizaje</w:t>
+      </w:r>
+    </w:p>
+    <w:p>
+      <w:pPr>
+        <w:jc w:val="center"/>
+        <w:rPr>
+          <w:b/>
+          <w:bCs/>
+          <w:sz w:val="36"/>
+          <w:szCs w:val="36"/>
+        </w:rPr>
+      </w:pPr>
+      <w:r>
+        <w:rPr>
+          <w:b/>
+          <w:bCs/>
+          <w:sz w:val="36"/>
+          <w:szCs w:val="36"/>
+        </w:rPr>
+        <w:t>Programa:</w:t>
+      </w:r>
+    </w:p>
+    <w:p>
+      <w:pPr>
+        <w:jc w:val="center"/>
+        <w:rPr>
+          <w:b/>
+          <w:bCs/>
+          <w:sz w:val="36"/>
+          <w:szCs w:val="36"/>
+        </w:rPr>
+      </w:pPr>
+      <w:r>
+        <w:rPr>
+          <w:b/>
+          <w:bCs/>
+          <w:sz w:val="36"/>
+          <w:szCs w:val="36"/>
+        </w:rPr>
+        <w:t>Técnico en programación de software</w:t>
+      </w:r>
+    </w:p>
+    <w:p>
+      <w:pPr>
+        <w:jc w:val="center"/>
+        <w:rPr>
+          <w:b/>
+          <w:bCs/>
+          <w:sz w:val="36"/>
+          <w:szCs w:val="36"/>
+        </w:rPr>
+      </w:pPr>
+    </w:p>
+    <w:p>
+      <w:pPr>
+        <w:jc w:val="center"/>
+        <w:rPr>
+          <w:b/>
+          <w:bCs/>
+          <w:sz w:val="36"/>
+          <w:szCs w:val="36"/>
+        </w:rPr>
+      </w:pPr>
+      <w:r>
+        <w:rPr>
+          <w:b/>
+          <w:bCs/>
+          <w:sz w:val="36"/>
+          <w:szCs w:val="36"/>
+        </w:rPr>
         <w:t>Sistema de Gestión y Monitoreo Térmico Automatizado.</w:t>
       </w:r>
     </w:p>
     <w:p>
       <w:pPr>
-        <w:rPr>
-          <w:lang w:val="es-ES"/>
-        </w:rPr>
-      </w:pPr>
-      <w:r>
-        <w:rPr>
-          <w:lang w:val="es-ES"/>
-        </w:rPr>
-        <w:br w:type="page"/>
-      </w:r>
-    </w:p>
-    <w:p>
-      <w:pPr>
-        <w:rPr>
+        <w:jc w:val="center"/>
+        <w:rPr>
+          <w:b/>
+          <w:bCs/>
+          <w:sz w:val="36"/>
+          <w:szCs w:val="36"/>
+        </w:rPr>
+      </w:pPr>
+    </w:p>
+    <w:p>
+      <w:pPr>
+        <w:jc w:val="center"/>
+        <w:rPr>
+          <w:b/>
+          <w:bCs/>
+          <w:sz w:val="36"/>
+          <w:szCs w:val="36"/>
+        </w:rPr>
+      </w:pPr>
+      <w:r>
+        <w:rPr>
+          <w:b/>
+          <w:bCs/>
+          <w:sz w:val="36"/>
+          <w:szCs w:val="36"/>
+        </w:rPr>
+        <w:t xml:space="preserve">Presentado </w:t>
+      </w:r>
+      <w:r>
+        <w:rPr>
+          <w:b/>
+          <w:bCs/>
+          <w:sz w:val="36"/>
+          <w:szCs w:val="36"/>
+        </w:rPr>
+        <w:t>por:</w:t>
+      </w:r>
+    </w:p>
+    <w:p>
+      <w:pPr>
+        <w:jc w:val="center"/>
+        <w:rPr>
+          <w:b/>
+          <w:bCs/>
+          <w:sz w:val="36"/>
+          <w:szCs w:val="36"/>
+        </w:rPr>
+      </w:pPr>
+      <w:r>
+        <w:rPr>
+          <w:b/>
+          <w:bCs/>
+          <w:sz w:val="36"/>
+          <w:szCs w:val="36"/>
+        </w:rPr>
+        <w:t xml:space="preserve">Deivis Johander </w:t>
+      </w:r>
+      <w:r>
+        <w:rPr>
+          <w:b/>
+          <w:bCs/>
+          <w:sz w:val="36"/>
+          <w:szCs w:val="36"/>
+        </w:rPr>
+        <w:t>Pérez</w:t>
+      </w:r>
+      <w:r>
+        <w:rPr>
+          <w:b/>
+          <w:bCs/>
+          <w:sz w:val="36"/>
+          <w:szCs w:val="36"/>
+        </w:rPr>
+        <w:t xml:space="preserve"> </w:t>
+      </w:r>
+      <w:r>
+        <w:rPr>
+          <w:b/>
+          <w:bCs/>
+          <w:sz w:val="36"/>
+          <w:szCs w:val="36"/>
+        </w:rPr>
+        <w:t>Martínez</w:t>
+      </w:r>
+    </w:p>
+    <w:p>
+      <w:pPr>
+        <w:jc w:val="center"/>
+        <w:rPr>
+          <w:b/>
+          <w:bCs/>
+          <w:sz w:val="36"/>
+          <w:szCs w:val="36"/>
+        </w:rPr>
+      </w:pPr>
+    </w:p>
+    <w:p>
+      <w:pPr>
+        <w:jc w:val="center"/>
+        <w:rPr>
+          <w:b/>
+          <w:bCs/>
+          <w:sz w:val="36"/>
+          <w:szCs w:val="36"/>
+        </w:rPr>
+      </w:pPr>
+      <w:r>
+        <w:rPr>
+          <w:b/>
+          <w:bCs/>
+          <w:sz w:val="36"/>
+          <w:szCs w:val="36"/>
+        </w:rPr>
+        <w:t>Instructor:</w:t>
+      </w:r>
+    </w:p>
+    <w:p>
+      <w:pPr>
+        <w:jc w:val="center"/>
+        <w:rPr>
+          <w:b/>
+          <w:bCs/>
+          <w:sz w:val="36"/>
+          <w:szCs w:val="36"/>
+        </w:rPr>
+      </w:pPr>
+      <w:r>
+        <w:rPr>
+          <w:b/>
+          <w:bCs/>
+          <w:sz w:val="36"/>
+          <w:szCs w:val="36"/>
+        </w:rPr>
+        <w:t>David leonardo cabezas Villamil</w:t>
+      </w:r>
+    </w:p>
+    <w:p>
+      <w:pPr>
+        <w:jc w:val="center"/>
+        <w:rPr>
+          <w:b/>
+          <w:bCs/>
+          <w:sz w:val="36"/>
+          <w:szCs w:val="36"/>
+        </w:rPr>
+      </w:pPr>
+    </w:p>
+    <w:p>
+      <w:pPr>
+        <w:jc w:val="center"/>
+        <w:rPr>
+          <w:b/>
+          <w:bCs/>
+          <w:sz w:val="36"/>
+          <w:szCs w:val="36"/>
+        </w:rPr>
+      </w:pPr>
+      <w:r>
+        <w:rPr>
+          <w:b/>
+          <w:bCs/>
+          <w:sz w:val="36"/>
+          <w:szCs w:val="36"/>
+        </w:rPr>
+        <w:t>Centro de diseño y Metrología</w:t>
+      </w:r>
+    </w:p>
+    <w:p>
+      <w:pPr>
+        <w:jc w:val="center"/>
+        <w:rPr>
+          <w:b/>
+          <w:bCs/>
+          <w:sz w:val="36"/>
+          <w:szCs w:val="36"/>
+        </w:rPr>
+      </w:pPr>
+      <w:r>
+        <w:rPr>
+          <w:b/>
+          <w:bCs/>
+          <w:sz w:val="36"/>
+          <w:szCs w:val="36"/>
+        </w:rPr>
+        <w:t>(</w:t>
+      </w:r>
+      <w:proofErr w:type="spellStart"/>
+      <w:r>
+        <w:rPr>
+          <w:b/>
+          <w:bCs/>
+          <w:sz w:val="36"/>
+          <w:szCs w:val="36"/>
+        </w:rPr>
+        <w:t>cdm</w:t>
+      </w:r>
+      <w:proofErr w:type="spellEnd"/>
+      <w:r>
+        <w:rPr>
+          <w:b/>
+          <w:bCs/>
+          <w:sz w:val="36"/>
+          <w:szCs w:val="36"/>
+        </w:rPr>
+        <w:t>)</w:t>
+      </w:r>
+    </w:p>
+    <w:p>
+      <w:pPr>
+        <w:jc w:val="center"/>
+        <w:rPr>
+          <w:b/>
+          <w:bCs/>
+          <w:sz w:val="36"/>
+          <w:szCs w:val="36"/>
+        </w:rPr>
+      </w:pPr>
+      <w:r>
+        <w:rPr>
+          <w:b/>
+          <w:bCs/>
+          <w:sz w:val="36"/>
+          <w:szCs w:val="36"/>
+        </w:rPr>
+        <w:t>Bogotá D.C</w:t>
+      </w:r>
+    </w:p>
+    <w:p>
+      <w:pPr>
+        <w:jc w:val="center"/>
+        <w:rPr>
+          <w:b/>
+          <w:bCs/>
+          <w:sz w:val="36"/>
+          <w:szCs w:val="36"/>
+        </w:rPr>
+      </w:pPr>
+      <w:r>
+        <w:rPr>
+          <w:b/>
+          <w:bCs/>
+          <w:sz w:val="36"/>
+          <w:szCs w:val="36"/>
+        </w:rPr>
+        <w:t>2026</w:t>
+      </w:r>
+    </w:p>
+    <w:p>
+      <w:pPr>
+        <w:rPr>
+          <w:lang w:val="es-ES"/>
+        </w:rPr>
+      </w:pPr>
+    </w:p>
+    <w:p>
+      <w:pPr>
+        <w:jc w:val="center"/>
+        <w:rPr>
+          <w:b/>
+          <w:bCs/>
+          <w:lang w:val="es-ES"/>
+        </w:rPr>
+      </w:pPr>
+      <w:r>
+        <w:rPr>
+          <w:b/>
+          <w:bCs/>
+          <w:lang w:val="es-ES"/>
+        </w:rPr>
+        <w:t>Tabla de contenido</w:t>
+      </w:r>
+    </w:p>
+    <w:p>
+      <w:pPr>
+        <w:jc w:val="center"/>
+        <w:rPr>
+          <w:b/>
+          <w:bCs/>
+          <w:lang w:val="es-ES"/>
+        </w:rPr>
+      </w:pPr>
+    </w:p>
+    <w:p>
+      <w:pPr>
+        <w:rPr>
+          <w:b/>
+          <w:bCs/>
+          <w:lang w:val="es-ES"/>
+        </w:rPr>
+      </w:pPr>
+      <w:proofErr w:type="gramStart"/>
+      <w:r>
+        <w:rPr>
+          <w:b/>
+          <w:bCs/>
+          <w:lang w:val="es-ES"/>
+        </w:rPr>
+        <w:t>INTRODUCCION  ---------------------------------------------------------------------</w:t>
+      </w:r>
+      <w:proofErr w:type="gramEnd"/>
+      <w:r>
+        <w:rPr>
+          <w:b/>
+          <w:bCs/>
+          <w:lang w:val="es-ES"/>
+        </w:rPr>
+        <w:t xml:space="preserve">  3</w:t>
+      </w:r>
+    </w:p>
+    <w:p>
+      <w:pPr>
+        <w:rPr>
+          <w:b/>
+          <w:bCs/>
+          <w:lang w:val="es-ES"/>
+        </w:rPr>
+      </w:pPr>
+      <w:r>
+        <w:rPr>
+          <w:b/>
+          <w:bCs/>
+          <w:lang w:val="es-ES"/>
+        </w:rPr>
+        <w:t>JUSTIFICACION DE PROYECTO ---------------------------------------------------- 4</w:t>
+      </w:r>
+    </w:p>
+    <w:p>
+      <w:pPr>
+        <w:rPr>
+          <w:b/>
+          <w:bCs/>
+          <w:lang w:val="es-ES"/>
+        </w:rPr>
+      </w:pPr>
+      <w:r>
+        <w:rPr>
+          <w:b/>
+          <w:bCs/>
+          <w:lang w:val="es-ES"/>
+        </w:rPr>
+        <w:t>DEFINICION DE PROBLEMA -------------------------------------------------------- 6</w:t>
+      </w:r>
+    </w:p>
+    <w:p>
+      <w:pPr>
+        <w:rPr>
+          <w:b/>
+          <w:bCs/>
+          <w:lang w:val="es-ES"/>
+        </w:rPr>
+      </w:pPr>
+      <w:r>
+        <w:rPr>
+          <w:b/>
+          <w:bCs/>
+          <w:lang w:val="es-ES"/>
+        </w:rPr>
+        <w:t xml:space="preserve">CONTEXTO ACTUAL </w:t>
+      </w:r>
+      <w:proofErr w:type="gramStart"/>
+      <w:r>
+        <w:rPr>
+          <w:b/>
+          <w:bCs/>
+          <w:lang w:val="es-ES"/>
+        </w:rPr>
+        <w:t>------------------------------------------------------------------  7</w:t>
+      </w:r>
+      <w:proofErr w:type="gramEnd"/>
+    </w:p>
+    <w:p>
+      <w:pPr>
+        <w:rPr>
+          <w:b/>
+          <w:bCs/>
+          <w:lang w:val="es-ES"/>
+        </w:rPr>
+      </w:pPr>
+      <w:r>
+        <w:rPr>
+          <w:b/>
+          <w:bCs/>
+          <w:lang w:val="es-ES"/>
+        </w:rPr>
+        <w:t xml:space="preserve">OBJETIVOS </w:t>
+      </w:r>
+      <w:proofErr w:type="gramStart"/>
+      <w:r>
+        <w:rPr>
+          <w:b/>
+          <w:bCs/>
+          <w:lang w:val="es-ES"/>
+        </w:rPr>
+        <w:t>-----------------------------------------------------------------------------  8</w:t>
+      </w:r>
+      <w:proofErr w:type="gramEnd"/>
+    </w:p>
+    <w:p>
+      <w:pPr>
+        <w:rPr>
+          <w:b/>
+          <w:bCs/>
+          <w:lang w:val="es-ES"/>
+        </w:rPr>
+      </w:pPr>
+      <w:r>
+        <w:rPr>
+          <w:b/>
+          <w:bCs/>
+          <w:lang w:val="es-ES"/>
+        </w:rPr>
+        <w:t>VARIABLES ENTRADA/SALIDA ----------------------------------------------------- 9</w:t>
+      </w:r>
+    </w:p>
+    <w:p>
+      <w:pPr>
+        <w:rPr>
+          <w:b/>
+          <w:bCs/>
+          <w:lang w:val="es-ES"/>
+        </w:rPr>
+      </w:pPr>
+      <w:r>
+        <w:rPr>
+          <w:b/>
+          <w:bCs/>
+          <w:lang w:val="es-ES"/>
+        </w:rPr>
+        <w:t>REGLAS Y CONDICIONES ----------------------------------------------------------- 12</w:t>
+      </w:r>
+    </w:p>
+    <w:p>
+      <w:pPr>
+        <w:rPr>
+          <w:b/>
+          <w:bCs/>
+          <w:lang w:val="es-ES"/>
+        </w:rPr>
+      </w:pPr>
+      <w:r>
+        <w:rPr>
+          <w:b/>
+          <w:bCs/>
+          <w:lang w:val="es-ES"/>
+        </w:rPr>
+        <w:t>DIAGRAMAS DE FLUJO --------------------------------------------------------------- 14</w:t>
+      </w:r>
+    </w:p>
+    <w:p>
+      <w:pPr>
+        <w:rPr>
+          <w:b/>
+          <w:bCs/>
+          <w:lang w:val="es-ES"/>
+        </w:rPr>
+      </w:pPr>
+      <w:r>
+        <w:rPr>
+          <w:b/>
+          <w:bCs/>
+          <w:lang w:val="es-ES"/>
+        </w:rPr>
+        <w:t>CONCLUSION -------------------------------------------------------------------------- 18</w:t>
+      </w:r>
+    </w:p>
+    <w:p>
+      <w:pPr>
+        <w:rPr>
+          <w:b/>
+          <w:bCs/>
           <w:lang w:val="es-ES"/>
         </w:rPr>
       </w:pPr>
@@ -3362,7 +3891,7 @@
           <w:szCs w:val="22"/>
         </w:rPr>
         <w:pict w14:anchorId="64FF90DF">
-          <v:rect id="_x0000_i1046" style="width:0;height:1.5pt" o:hralign="center" o:hrstd="t" o:hr="t" fillcolor="#a0a0a0" stroked="f"/>
+          <v:rect id="_x0000_i1025" style="width:0;height:1.5pt" o:hralign="center" o:hrstd="t" o:hr="t" fillcolor="#a0a0a0" stroked="f"/>
         </w:pict>
       </w:r>
     </w:p>
@@ -6153,6 +6682,761 @@
         </w:rPr>
         <w:lastRenderedPageBreak/>
         <w:t>Diagramas</w:t>
+      </w:r>
+    </w:p>
+    <w:p>
+      <w:pPr>
+        <w:tabs>
+          <w:tab w:val="left" w:pos="1170"/>
+        </w:tabs>
+        <w:jc w:val="center"/>
+        <w:rPr>
+          <w:b/>
+          <w:bCs/>
+          <w:sz w:val="28"/>
+          <w:szCs w:val="28"/>
+          <w:lang w:val="es-ES"/>
+        </w:rPr>
+      </w:pPr>
+    </w:p>
+    <w:p>
+      <w:pPr>
+        <w:tabs>
+          <w:tab w:val="left" w:pos="1170"/>
+        </w:tabs>
+        <w:jc w:val="center"/>
+        <w:rPr>
+          <w:b/>
+          <w:bCs/>
+          <w:sz w:val="28"/>
+          <w:szCs w:val="28"/>
+          <w:lang w:val="es-ES"/>
+        </w:rPr>
+      </w:pPr>
+      <w:r>
+        <w:rPr>
+          <w:b/>
+          <w:bCs/>
+          <w:sz w:val="28"/>
+          <w:szCs w:val="28"/>
+          <w:lang w:val="es-ES"/>
+        </w:rPr>
+        <w:t>Primer modulo</w:t>
+      </w:r>
+      <w:r>
+        <w:rPr>
+          <w:b/>
+          <w:bCs/>
+          <w:sz w:val="28"/>
+          <w:szCs w:val="28"/>
+          <w:lang w:val="es-ES"/>
+        </w:rPr>
+        <w:br/>
+      </w:r>
+      <w:r>
+        <w:rPr>
+          <w:b/>
+          <w:bCs/>
+          <w:sz w:val="28"/>
+          <w:szCs w:val="28"/>
+          <w:lang w:val="es-ES"/>
+        </w:rPr>
+        <w:br/>
+      </w:r>
+      <w:r>
+        <w:rPr>
+          <w:noProof/>
+        </w:rPr>
+        <w:drawing>
+          <wp:inline distT="0" distB="0" distL="0" distR="0" wp14:anchorId="244DE571" wp14:editId="2778EEF9">
+            <wp:extent cx="5971540" cy="6009640"/>
+            <wp:effectExtent l="0" t="0" r="0" b="0"/>
+            <wp:docPr id="1126331891" name="Imagen 1"/>
+            <wp:cNvGraphicFramePr>
+              <a:graphicFrameLocks xmlns:a="http://schemas.openxmlformats.org/drawingml/2006/main" noChangeAspect="1"/>
+            </wp:cNvGraphicFramePr>
+            <a:graphic xmlns:a="http://schemas.openxmlformats.org/drawingml/2006/main">
+              <a:graphicData uri="http://schemas.openxmlformats.org/drawingml/2006/picture">
+                <pic:pic xmlns:pic="http://schemas.openxmlformats.org/drawingml/2006/picture">
+                  <pic:nvPicPr>
+                    <pic:cNvPr id="0" name="Picture 2"/>
+                    <pic:cNvPicPr>
+                      <a:picLocks noChangeAspect="1" noChangeArrowheads="1"/>
+                    </pic:cNvPicPr>
+                  </pic:nvPicPr>
+                  <pic:blipFill>
+                    <a:blip r:embed="rId7">
+                      <a:extLst>
+                        <a:ext uri="{28A0092B-C50C-407E-A947-70E740481C1C}">
+                          <a14:useLocalDpi xmlns:a14="http://schemas.microsoft.com/office/drawing/2010/main" val="0"/>
+                        </a:ext>
+                      </a:extLst>
+                    </a:blip>
+                    <a:srcRect/>
+                    <a:stretch>
+                      <a:fillRect/>
+                    </a:stretch>
+                  </pic:blipFill>
+                  <pic:spPr bwMode="auto">
+                    <a:xfrm>
+                      <a:off x="0" y="0"/>
+                      <a:ext cx="5971540" cy="6009640"/>
+                    </a:xfrm>
+                    <a:prstGeom prst="rect">
+                      <a:avLst/>
+                    </a:prstGeom>
+                    <a:noFill/>
+                    <a:ln>
+                      <a:noFill/>
+                    </a:ln>
+                  </pic:spPr>
+                </pic:pic>
+              </a:graphicData>
+            </a:graphic>
+          </wp:inline>
+        </w:drawing>
+      </w:r>
+    </w:p>
+    <w:p>
+      <w:pPr>
+        <w:tabs>
+          <w:tab w:val="left" w:pos="1170"/>
+        </w:tabs>
+        <w:jc w:val="center"/>
+        <w:rPr>
+          <w:b/>
+          <w:bCs/>
+          <w:sz w:val="28"/>
+          <w:szCs w:val="28"/>
+          <w:lang w:val="es-ES"/>
+        </w:rPr>
+      </w:pPr>
+    </w:p>
+    <w:p>
+      <w:pPr>
+        <w:rPr>
+          <w:b/>
+          <w:bCs/>
+          <w:sz w:val="28"/>
+          <w:szCs w:val="28"/>
+          <w:lang w:val="es-ES"/>
+        </w:rPr>
+      </w:pPr>
+      <w:r>
+        <w:rPr>
+          <w:b/>
+          <w:bCs/>
+          <w:sz w:val="28"/>
+          <w:szCs w:val="28"/>
+          <w:lang w:val="es-ES"/>
+        </w:rPr>
+        <w:br w:type="page"/>
+      </w:r>
+    </w:p>
+    <w:p>
+      <w:pPr>
+        <w:tabs>
+          <w:tab w:val="left" w:pos="1170"/>
+        </w:tabs>
+        <w:jc w:val="center"/>
+        <w:rPr>
+          <w:b/>
+          <w:bCs/>
+          <w:sz w:val="28"/>
+          <w:szCs w:val="28"/>
+          <w:lang w:val="es-ES"/>
+        </w:rPr>
+      </w:pPr>
+      <w:r>
+        <w:rPr>
+          <w:b/>
+          <w:bCs/>
+          <w:sz w:val="28"/>
+          <w:szCs w:val="28"/>
+          <w:lang w:val="es-ES"/>
+        </w:rPr>
+        <w:lastRenderedPageBreak/>
+        <w:t>Segundo modulo:</w:t>
+      </w:r>
+      <w:r>
+        <w:rPr>
+          <w:b/>
+          <w:bCs/>
+          <w:sz w:val="28"/>
+          <w:szCs w:val="28"/>
+          <w:lang w:val="es-ES"/>
+        </w:rPr>
+        <w:br/>
+      </w:r>
+      <w:r>
+        <w:rPr>
+          <w:b/>
+          <w:bCs/>
+          <w:sz w:val="28"/>
+          <w:szCs w:val="28"/>
+          <w:lang w:val="es-ES"/>
+        </w:rPr>
+        <w:br/>
+      </w:r>
+      <w:r>
+        <w:rPr>
+          <w:noProof/>
+        </w:rPr>
+        <w:drawing>
+          <wp:inline distT="0" distB="0" distL="0" distR="0" wp14:anchorId="6591F04A" wp14:editId="31E8CD62">
+            <wp:extent cx="5600700" cy="6200775"/>
+            <wp:effectExtent l="0" t="0" r="0" b="9525"/>
+            <wp:docPr id="1573977997" name="Imagen 2"/>
+            <wp:cNvGraphicFramePr>
+              <a:graphicFrameLocks xmlns:a="http://schemas.openxmlformats.org/drawingml/2006/main" noChangeAspect="1"/>
+            </wp:cNvGraphicFramePr>
+            <a:graphic xmlns:a="http://schemas.openxmlformats.org/drawingml/2006/main">
+              <a:graphicData uri="http://schemas.openxmlformats.org/drawingml/2006/picture">
+                <pic:pic xmlns:pic="http://schemas.openxmlformats.org/drawingml/2006/picture">
+                  <pic:nvPicPr>
+                    <pic:cNvPr id="0" name="Picture 4"/>
+                    <pic:cNvPicPr>
+                      <a:picLocks noChangeAspect="1" noChangeArrowheads="1"/>
+                    </pic:cNvPicPr>
+                  </pic:nvPicPr>
+                  <pic:blipFill>
+                    <a:blip r:embed="rId8">
+                      <a:extLst>
+                        <a:ext uri="{28A0092B-C50C-407E-A947-70E740481C1C}">
+                          <a14:useLocalDpi xmlns:a14="http://schemas.microsoft.com/office/drawing/2010/main" val="0"/>
+                        </a:ext>
+                      </a:extLst>
+                    </a:blip>
+                    <a:srcRect/>
+                    <a:stretch>
+                      <a:fillRect/>
+                    </a:stretch>
+                  </pic:blipFill>
+                  <pic:spPr bwMode="auto">
+                    <a:xfrm>
+                      <a:off x="0" y="0"/>
+                      <a:ext cx="5600700" cy="6200775"/>
+                    </a:xfrm>
+                    <a:prstGeom prst="rect">
+                      <a:avLst/>
+                    </a:prstGeom>
+                    <a:noFill/>
+                    <a:ln>
+                      <a:noFill/>
+                    </a:ln>
+                  </pic:spPr>
+                </pic:pic>
+              </a:graphicData>
+            </a:graphic>
+          </wp:inline>
+        </w:drawing>
+      </w:r>
+    </w:p>
+    <w:p>
+      <w:pPr>
+        <w:tabs>
+          <w:tab w:val="left" w:pos="1170"/>
+        </w:tabs>
+        <w:jc w:val="center"/>
+        <w:rPr>
+          <w:b/>
+          <w:bCs/>
+          <w:sz w:val="28"/>
+          <w:szCs w:val="28"/>
+          <w:lang w:val="es-ES"/>
+        </w:rPr>
+      </w:pPr>
+    </w:p>
+    <w:p>
+      <w:pPr>
+        <w:rPr>
+          <w:b/>
+          <w:bCs/>
+          <w:sz w:val="28"/>
+          <w:szCs w:val="28"/>
+          <w:lang w:val="es-ES"/>
+        </w:rPr>
+      </w:pPr>
+      <w:r>
+        <w:rPr>
+          <w:b/>
+          <w:bCs/>
+          <w:sz w:val="28"/>
+          <w:szCs w:val="28"/>
+          <w:lang w:val="es-ES"/>
+        </w:rPr>
+        <w:br w:type="page"/>
+      </w:r>
+    </w:p>
+    <w:p>
+      <w:pPr>
+        <w:tabs>
+          <w:tab w:val="left" w:pos="1170"/>
+        </w:tabs>
+        <w:jc w:val="center"/>
+        <w:rPr>
+          <w:b/>
+          <w:bCs/>
+          <w:sz w:val="28"/>
+          <w:szCs w:val="28"/>
+          <w:lang w:val="es-ES"/>
+        </w:rPr>
+      </w:pPr>
+      <w:r>
+        <w:rPr>
+          <w:b/>
+          <w:bCs/>
+          <w:sz w:val="28"/>
+          <w:szCs w:val="28"/>
+          <w:lang w:val="es-ES"/>
+        </w:rPr>
+        <w:lastRenderedPageBreak/>
+        <w:t>Tercer modulo:</w:t>
+      </w:r>
+    </w:p>
+    <w:p>
+      <w:pPr>
+        <w:tabs>
+          <w:tab w:val="left" w:pos="1170"/>
+        </w:tabs>
+        <w:jc w:val="center"/>
+        <w:rPr>
+          <w:b/>
+          <w:bCs/>
+          <w:sz w:val="28"/>
+          <w:szCs w:val="28"/>
+          <w:lang w:val="es-ES"/>
+        </w:rPr>
+      </w:pPr>
+    </w:p>
+    <w:p>
+      <w:pPr>
+        <w:tabs>
+          <w:tab w:val="left" w:pos="1170"/>
+        </w:tabs>
+        <w:jc w:val="center"/>
+        <w:rPr>
+          <w:b/>
+          <w:bCs/>
+          <w:sz w:val="28"/>
+          <w:szCs w:val="28"/>
+          <w:lang w:val="es-ES"/>
+        </w:rPr>
+      </w:pPr>
+      <w:r>
+        <w:rPr>
+          <w:noProof/>
+        </w:rPr>
+        <w:drawing>
+          <wp:inline distT="0" distB="0" distL="0" distR="0" wp14:anchorId="21763D29" wp14:editId="67D418C6">
+            <wp:extent cx="5971540" cy="6863715"/>
+            <wp:effectExtent l="0" t="0" r="0" b="0"/>
+            <wp:docPr id="1112634375" name="Imagen 4"/>
+            <wp:cNvGraphicFramePr>
+              <a:graphicFrameLocks xmlns:a="http://schemas.openxmlformats.org/drawingml/2006/main" noChangeAspect="1"/>
+            </wp:cNvGraphicFramePr>
+            <a:graphic xmlns:a="http://schemas.openxmlformats.org/drawingml/2006/main">
+              <a:graphicData uri="http://schemas.openxmlformats.org/drawingml/2006/picture">
+                <pic:pic xmlns:pic="http://schemas.openxmlformats.org/drawingml/2006/picture">
+                  <pic:nvPicPr>
+                    <pic:cNvPr id="0" name="Picture 11"/>
+                    <pic:cNvPicPr>
+                      <a:picLocks noChangeAspect="1" noChangeArrowheads="1"/>
+                    </pic:cNvPicPr>
+                  </pic:nvPicPr>
+                  <pic:blipFill>
+                    <a:blip r:embed="rId9">
+                      <a:extLst>
+                        <a:ext uri="{28A0092B-C50C-407E-A947-70E740481C1C}">
+                          <a14:useLocalDpi xmlns:a14="http://schemas.microsoft.com/office/drawing/2010/main" val="0"/>
+                        </a:ext>
+                      </a:extLst>
+                    </a:blip>
+                    <a:srcRect/>
+                    <a:stretch>
+                      <a:fillRect/>
+                    </a:stretch>
+                  </pic:blipFill>
+                  <pic:spPr bwMode="auto">
+                    <a:xfrm>
+                      <a:off x="0" y="0"/>
+                      <a:ext cx="5971540" cy="6863715"/>
+                    </a:xfrm>
+                    <a:prstGeom prst="rect">
+                      <a:avLst/>
+                    </a:prstGeom>
+                    <a:noFill/>
+                    <a:ln>
+                      <a:noFill/>
+                    </a:ln>
+                  </pic:spPr>
+                </pic:pic>
+              </a:graphicData>
+            </a:graphic>
+          </wp:inline>
+        </w:drawing>
+      </w:r>
+    </w:p>
+    <w:p>
+      <w:pPr>
+        <w:rPr>
+          <w:b/>
+          <w:bCs/>
+          <w:sz w:val="28"/>
+          <w:szCs w:val="28"/>
+          <w:lang w:val="es-ES"/>
+        </w:rPr>
+      </w:pPr>
+      <w:r>
+        <w:rPr>
+          <w:b/>
+          <w:bCs/>
+          <w:sz w:val="28"/>
+          <w:szCs w:val="28"/>
+          <w:lang w:val="es-ES"/>
+        </w:rPr>
+        <w:br w:type="page"/>
+      </w:r>
+    </w:p>
+    <w:p>
+      <w:pPr>
+        <w:tabs>
+          <w:tab w:val="left" w:pos="1170"/>
+        </w:tabs>
+        <w:jc w:val="center"/>
+        <w:rPr>
+          <w:b/>
+          <w:bCs/>
+          <w:sz w:val="28"/>
+          <w:szCs w:val="28"/>
+          <w:lang w:val="es-ES"/>
+        </w:rPr>
+      </w:pPr>
+      <w:r>
+        <w:rPr>
+          <w:b/>
+          <w:bCs/>
+          <w:sz w:val="28"/>
+          <w:szCs w:val="28"/>
+          <w:lang w:val="es-ES"/>
+        </w:rPr>
+        <w:lastRenderedPageBreak/>
+        <w:t>Cuarto modulo:</w:t>
+      </w:r>
+      <w:r>
+        <w:rPr>
+          <w:b/>
+          <w:bCs/>
+          <w:sz w:val="28"/>
+          <w:szCs w:val="28"/>
+          <w:lang w:val="es-ES"/>
+        </w:rPr>
+        <w:br/>
+      </w:r>
+      <w:r>
+        <w:rPr>
+          <w:b/>
+          <w:bCs/>
+          <w:sz w:val="28"/>
+          <w:szCs w:val="28"/>
+          <w:lang w:val="es-ES"/>
+        </w:rPr>
+        <w:br/>
+      </w:r>
+      <w:r>
+        <w:rPr>
+          <w:noProof/>
+        </w:rPr>
+        <w:drawing>
+          <wp:inline distT="0" distB="0" distL="0" distR="0" wp14:anchorId="696122EB" wp14:editId="4C41AC96">
+            <wp:extent cx="4448175" cy="6372225"/>
+            <wp:effectExtent l="0" t="0" r="9525" b="9525"/>
+            <wp:docPr id="43739688" name="Imagen 5"/>
+            <wp:cNvGraphicFramePr>
+              <a:graphicFrameLocks xmlns:a="http://schemas.openxmlformats.org/drawingml/2006/main" noChangeAspect="1"/>
+            </wp:cNvGraphicFramePr>
+            <a:graphic xmlns:a="http://schemas.openxmlformats.org/drawingml/2006/main">
+              <a:graphicData uri="http://schemas.openxmlformats.org/drawingml/2006/picture">
+                <pic:pic xmlns:pic="http://schemas.openxmlformats.org/drawingml/2006/picture">
+                  <pic:nvPicPr>
+                    <pic:cNvPr id="0" name="Picture 13"/>
+                    <pic:cNvPicPr>
+                      <a:picLocks noChangeAspect="1" noChangeArrowheads="1"/>
+                    </pic:cNvPicPr>
+                  </pic:nvPicPr>
+                  <pic:blipFill>
+                    <a:blip r:embed="rId10">
+                      <a:extLst>
+                        <a:ext uri="{28A0092B-C50C-407E-A947-70E740481C1C}">
+                          <a14:useLocalDpi xmlns:a14="http://schemas.microsoft.com/office/drawing/2010/main" val="0"/>
+                        </a:ext>
+                      </a:extLst>
+                    </a:blip>
+                    <a:srcRect/>
+                    <a:stretch>
+                      <a:fillRect/>
+                    </a:stretch>
+                  </pic:blipFill>
+                  <pic:spPr bwMode="auto">
+                    <a:xfrm>
+                      <a:off x="0" y="0"/>
+                      <a:ext cx="4448175" cy="6372225"/>
+                    </a:xfrm>
+                    <a:prstGeom prst="rect">
+                      <a:avLst/>
+                    </a:prstGeom>
+                    <a:noFill/>
+                    <a:ln>
+                      <a:noFill/>
+                    </a:ln>
+                  </pic:spPr>
+                </pic:pic>
+              </a:graphicData>
+            </a:graphic>
+          </wp:inline>
+        </w:drawing>
+      </w:r>
+    </w:p>
+    <w:p>
+      <w:pPr>
+        <w:tabs>
+          <w:tab w:val="left" w:pos="1170"/>
+        </w:tabs>
+        <w:jc w:val="center"/>
+        <w:rPr>
+          <w:b/>
+          <w:bCs/>
+          <w:sz w:val="28"/>
+          <w:szCs w:val="28"/>
+          <w:lang w:val="es-ES"/>
+        </w:rPr>
+      </w:pPr>
+    </w:p>
+    <w:p>
+      <w:pPr>
+        <w:tabs>
+          <w:tab w:val="left" w:pos="1170"/>
+        </w:tabs>
+        <w:jc w:val="center"/>
+        <w:rPr>
+          <w:b/>
+          <w:bCs/>
+          <w:sz w:val="28"/>
+          <w:szCs w:val="28"/>
+          <w:lang w:val="es-ES"/>
+        </w:rPr>
+      </w:pPr>
+    </w:p>
+    <w:p>
+      <w:pPr>
+        <w:tabs>
+          <w:tab w:val="left" w:pos="1170"/>
+        </w:tabs>
+        <w:jc w:val="center"/>
+        <w:rPr>
+          <w:b/>
+          <w:bCs/>
+          <w:sz w:val="28"/>
+          <w:szCs w:val="28"/>
+          <w:lang w:val="es-ES"/>
+        </w:rPr>
+      </w:pPr>
+    </w:p>
+    <w:p>
+      <w:pPr>
+        <w:tabs>
+          <w:tab w:val="left" w:pos="1170"/>
+        </w:tabs>
+        <w:jc w:val="center"/>
+        <w:rPr>
+          <w:sz w:val="28"/>
+          <w:szCs w:val="28"/>
+          <w:lang w:val="es-ES"/>
+        </w:rPr>
+      </w:pPr>
+      <w:r>
+        <w:rPr>
+          <w:b/>
+          <w:bCs/>
+          <w:sz w:val="28"/>
+          <w:szCs w:val="28"/>
+          <w:lang w:val="es-ES"/>
+        </w:rPr>
+        <w:lastRenderedPageBreak/>
+        <w:t>Conclusión:</w:t>
+      </w:r>
+      <w:r>
+        <w:rPr>
+          <w:b/>
+          <w:bCs/>
+          <w:sz w:val="28"/>
+          <w:szCs w:val="28"/>
+          <w:lang w:val="es-ES"/>
+        </w:rPr>
+        <w:br/>
+      </w:r>
+      <w:r>
+        <w:rPr>
+          <w:b/>
+          <w:bCs/>
+          <w:sz w:val="28"/>
+          <w:szCs w:val="28"/>
+          <w:lang w:val="es-ES"/>
+        </w:rPr>
+        <w:br/>
+      </w:r>
+      <w:r>
+        <w:rPr>
+          <w:sz w:val="28"/>
+          <w:szCs w:val="28"/>
+          <w:lang w:val="es-ES"/>
+        </w:rPr>
+        <w:t>El desarrollo de este sistema de análisis meteorológico demuestra cómo la automatización y el pensamiento computacional pueden transformar datos numéricos aislados en información de alto valor para la toma de decisiones. A través de la implementación de este proyecto, se han logrado validar las siguientes premisas:</w:t>
+      </w:r>
+    </w:p>
+    <w:p>
+      <w:pPr>
+        <w:tabs>
+          <w:tab w:val="left" w:pos="1170"/>
+        </w:tabs>
+        <w:jc w:val="center"/>
+        <w:rPr>
+          <w:sz w:val="28"/>
+          <w:szCs w:val="28"/>
+          <w:lang w:val="es-ES"/>
+        </w:rPr>
+      </w:pPr>
+    </w:p>
+    <w:p>
+      <w:pPr>
+        <w:tabs>
+          <w:tab w:val="left" w:pos="1170"/>
+        </w:tabs>
+        <w:jc w:val="center"/>
+        <w:rPr>
+          <w:sz w:val="28"/>
+          <w:szCs w:val="28"/>
+          <w:lang w:val="es-ES"/>
+        </w:rPr>
+      </w:pPr>
+      <w:r>
+        <w:rPr>
+          <w:sz w:val="28"/>
+          <w:szCs w:val="28"/>
+          <w:lang w:val="es-ES"/>
+        </w:rPr>
+        <w:t>Eficiencia en la Interpretación: La transición de simples valores decimales a clasificaciones categóricas (como "Temperatura Alta" o "Riesgo de Sequía") elimina la ambigüedad y permite que cualquier usuario, sin importar su formación técnica, comprenda el estado del entorno de manera inmediata.</w:t>
+      </w:r>
+    </w:p>
+    <w:p>
+      <w:pPr>
+        <w:tabs>
+          <w:tab w:val="left" w:pos="1170"/>
+        </w:tabs>
+        <w:jc w:val="center"/>
+        <w:rPr>
+          <w:sz w:val="28"/>
+          <w:szCs w:val="28"/>
+          <w:lang w:val="es-ES"/>
+        </w:rPr>
+      </w:pPr>
+    </w:p>
+    <w:p>
+      <w:pPr>
+        <w:tabs>
+          <w:tab w:val="left" w:pos="1170"/>
+        </w:tabs>
+        <w:jc w:val="center"/>
+        <w:rPr>
+          <w:sz w:val="28"/>
+          <w:szCs w:val="28"/>
+          <w:lang w:val="es-ES"/>
+        </w:rPr>
+      </w:pPr>
+      <w:r>
+        <w:rPr>
+          <w:sz w:val="28"/>
+          <w:szCs w:val="28"/>
+          <w:lang w:val="es-ES"/>
+        </w:rPr>
+        <w:t>Integración de Variables Complejas: El uso de un indicador de cambio climático junto con la temperatura base permite que el sistema no solo describa el "ahora", sino que contextualice la situación dentro de un marco ambiental más amplio, facilitando la detección de anomalías climáticas extremas.</w:t>
+      </w:r>
+    </w:p>
+    <w:p>
+      <w:pPr>
+        <w:tabs>
+          <w:tab w:val="left" w:pos="1170"/>
+        </w:tabs>
+        <w:jc w:val="center"/>
+        <w:rPr>
+          <w:sz w:val="28"/>
+          <w:szCs w:val="28"/>
+          <w:lang w:val="es-ES"/>
+        </w:rPr>
+      </w:pPr>
+    </w:p>
+    <w:p>
+      <w:pPr>
+        <w:tabs>
+          <w:tab w:val="left" w:pos="1170"/>
+        </w:tabs>
+        <w:jc w:val="center"/>
+        <w:rPr>
+          <w:sz w:val="28"/>
+          <w:szCs w:val="28"/>
+          <w:lang w:val="es-ES"/>
+        </w:rPr>
+      </w:pPr>
+      <w:r>
+        <w:rPr>
+          <w:sz w:val="28"/>
+          <w:szCs w:val="28"/>
+          <w:lang w:val="es-ES"/>
+        </w:rPr>
+        <w:t>Robustez del Software: Mediante la definición clara de módulos (Ingreso, Procesamiento y Salida) y la aplicación de reglas de validación, se garantiza un sistema confiable que minimiza el error humano y asegura la integridad de los datos climáticos recolectados.</w:t>
+      </w:r>
+    </w:p>
+    <w:p>
+      <w:pPr>
+        <w:tabs>
+          <w:tab w:val="left" w:pos="1170"/>
+        </w:tabs>
+        <w:jc w:val="center"/>
+        <w:rPr>
+          <w:sz w:val="28"/>
+          <w:szCs w:val="28"/>
+          <w:lang w:val="es-ES"/>
+        </w:rPr>
+      </w:pPr>
+    </w:p>
+    <w:p>
+      <w:pPr>
+        <w:tabs>
+          <w:tab w:val="left" w:pos="1170"/>
+        </w:tabs>
+        <w:jc w:val="center"/>
+        <w:rPr>
+          <w:sz w:val="28"/>
+          <w:szCs w:val="28"/>
+          <w:lang w:val="es-ES"/>
+        </w:rPr>
+      </w:pPr>
+      <w:r>
+        <w:rPr>
+          <w:sz w:val="28"/>
+          <w:szCs w:val="28"/>
+          <w:lang w:val="es-ES"/>
+        </w:rPr>
+        <w:t xml:space="preserve">En definitiva, este programa no solo cumple con un objetivo académico de programación, sino que se posiciona como un prototipo funcional de tecnología para la sostenibilidad. En un mundo donde el cambio climático es un desafío crítico, herramientas como esta son esenciales para fortalecer la </w:t>
+      </w:r>
+      <w:r>
+        <w:rPr>
+          <w:sz w:val="28"/>
+          <w:szCs w:val="28"/>
+          <w:lang w:val="es-ES"/>
+        </w:rPr>
+        <w:lastRenderedPageBreak/>
+        <w:t>conciencia ambiental y mejorar la capacidad de respuesta de las comunidades ante fenómenos naturales</w:t>
       </w:r>
     </w:p>
     <w:sectPr>
@@ -6925,6 +8209,7 @@
   <w:style w:type="character" w:default="1" w:styleId="Fuentedeprrafopredeter">
     <w:name w:val="Default Paragraph Font"/>
     <w:uiPriority w:val="1"/>
+    <w:semiHidden/>
     <w:unhideWhenUsed/>
   </w:style>
   <w:style w:type="table" w:default="1" w:styleId="Tablanormal">

</xml_diff>